<commit_message>
Projeto MySQL Ling C provedor Railway ..
</commit_message>
<xml_diff>
--- a/02 Exercises/Projeto Linguagem C com MySQL no Provedor Cloud Railway/Instalação, Configuração e Execução MySQL Provedor RailWay Cloud Linguagem C.docx
+++ b/02 Exercises/Projeto Linguagem C com MySQL no Provedor Cloud Railway/Instalação, Configuração e Execução MySQL Provedor RailWay Cloud Linguagem C.docx
@@ -210,15 +210,7 @@
           <w:sz w:val="28"/>
           <w:szCs w:val="28"/>
         </w:rPr>
-        <w:t xml:space="preserve"> </w:t>
-      </w:r>
-      <w:r>
-        <w:rPr>
-          <w:rFonts w:ascii="Times New Roman" w:hAnsi="Times New Roman" w:cs="Times New Roman"/>
-          <w:sz w:val="28"/>
-          <w:szCs w:val="28"/>
-        </w:rPr>
-        <w:t xml:space="preserve">com </w:t>
+        <w:t xml:space="preserve"> com </w:t>
       </w:r>
       <w:proofErr w:type="spellStart"/>
       <w:r>
@@ -426,27 +418,7 @@
           <w:sz w:val="28"/>
           <w:szCs w:val="28"/>
         </w:rPr>
-        <w:t>Opção</w:t>
-      </w:r>
-      <w:r>
-        <w:rPr>
-          <w:rFonts w:ascii="Times New Roman" w:hAnsi="Times New Roman" w:cs="Times New Roman"/>
-          <w:b/>
-          <w:bCs/>
-          <w:sz w:val="28"/>
-          <w:szCs w:val="28"/>
-        </w:rPr>
-        <w:t xml:space="preserve"> 4</w:t>
-      </w:r>
-      <w:r>
-        <w:rPr>
-          <w:rFonts w:ascii="Times New Roman" w:hAnsi="Times New Roman" w:cs="Times New Roman"/>
-          <w:b/>
-          <w:bCs/>
-          <w:sz w:val="28"/>
-          <w:szCs w:val="28"/>
-        </w:rPr>
-        <w:t xml:space="preserve"> </w:t>
+        <w:t xml:space="preserve">Opção 4 </w:t>
       </w:r>
       <w:r>
         <w:rPr>
@@ -1910,6 +1882,7 @@
           <w:rFonts w:ascii="Times New Roman" w:hAnsi="Times New Roman" w:cs="Times New Roman"/>
           <w:sz w:val="28"/>
           <w:szCs w:val="28"/>
+          <w:lang w:val="en-US"/>
         </w:rPr>
       </w:pPr>
     </w:p>
@@ -4394,24 +4367,40 @@
           <w:sz w:val="28"/>
           <w:szCs w:val="28"/>
         </w:rPr>
-        <w:t xml:space="preserve"> C</w:t>
-      </w:r>
-      <w:r>
-        <w:rPr>
-          <w:rFonts w:ascii="Times New Roman" w:hAnsi="Times New Roman" w:cs="Times New Roman"/>
-          <w:sz w:val="28"/>
-          <w:szCs w:val="28"/>
-        </w:rPr>
-        <w:t xml:space="preserve">, pasta </w:t>
+        <w:t xml:space="preserve"> C, pasta </w:t>
       </w:r>
       <w:proofErr w:type="spellStart"/>
       <w:r>
         <w:rPr>
           <w:rFonts w:ascii="Times New Roman" w:hAnsi="Times New Roman" w:cs="Times New Roman"/>
+          <w:b/>
+          <w:bCs/>
           <w:sz w:val="28"/>
           <w:szCs w:val="28"/>
         </w:rPr>
         <w:t>mysql</w:t>
+      </w:r>
+      <w:proofErr w:type="spellEnd"/>
+      <w:r>
+        <w:rPr>
+          <w:rFonts w:ascii="Times New Roman" w:hAnsi="Times New Roman" w:cs="Times New Roman"/>
+          <w:b/>
+          <w:bCs/>
+          <w:sz w:val="28"/>
+          <w:szCs w:val="28"/>
+        </w:rPr>
+        <w:t>\</w:t>
+      </w:r>
+      <w:proofErr w:type="spellStart"/>
+      <w:r>
+        <w:rPr>
+          <w:rFonts w:ascii="Times New Roman" w:hAnsi="Times New Roman" w:cs="Times New Roman"/>
+          <w:b/>
+          <w:bCs/>
+          <w:sz w:val="28"/>
+          <w:szCs w:val="28"/>
+        </w:rPr>
+        <w:t>lib</w:t>
       </w:r>
       <w:proofErr w:type="spellEnd"/>
       <w:r>
@@ -4442,23 +4431,7 @@
           <w:sz w:val="28"/>
           <w:szCs w:val="28"/>
         </w:rPr>
-        <w:t>Ger</w:t>
-      </w:r>
-      <w:r>
-        <w:rPr>
-          <w:rFonts w:ascii="Times New Roman" w:hAnsi="Times New Roman" w:cs="Times New Roman"/>
-          <w:sz w:val="28"/>
-          <w:szCs w:val="28"/>
-        </w:rPr>
-        <w:t>ar</w:t>
-      </w:r>
-      <w:r>
-        <w:rPr>
-          <w:rFonts w:ascii="Times New Roman" w:hAnsi="Times New Roman" w:cs="Times New Roman"/>
-          <w:sz w:val="28"/>
-          <w:szCs w:val="28"/>
-        </w:rPr>
-        <w:t xml:space="preserve"> o DEF pelo </w:t>
+        <w:t xml:space="preserve">Gerar o DEF pelo </w:t>
       </w:r>
       <w:r>
         <w:rPr>
@@ -4476,15 +4449,7 @@
           <w:sz w:val="28"/>
           <w:szCs w:val="28"/>
         </w:rPr>
-        <w:t xml:space="preserve"> do Windows</w:t>
-      </w:r>
-      <w:r>
-        <w:rPr>
-          <w:rFonts w:ascii="Times New Roman" w:hAnsi="Times New Roman" w:cs="Times New Roman"/>
-          <w:sz w:val="28"/>
-          <w:szCs w:val="28"/>
-        </w:rPr>
-        <w:t xml:space="preserve"> (</w:t>
+        <w:t xml:space="preserve"> do Windows (</w:t>
       </w:r>
       <w:r>
         <w:rPr>
@@ -4806,31 +4771,7 @@
           <w:sz w:val="28"/>
           <w:szCs w:val="28"/>
         </w:rPr>
-        <w:t>: Se</w:t>
-      </w:r>
-      <w:r>
-        <w:rPr>
-          <w:rFonts w:ascii="Times New Roman" w:hAnsi="Times New Roman" w:cs="Times New Roman"/>
-          <w:sz w:val="28"/>
-          <w:szCs w:val="28"/>
-        </w:rPr>
-        <w:t xml:space="preserve"> aparece</w:t>
-      </w:r>
-      <w:r>
-        <w:rPr>
-          <w:rFonts w:ascii="Times New Roman" w:hAnsi="Times New Roman" w:cs="Times New Roman"/>
-          <w:sz w:val="28"/>
-          <w:szCs w:val="28"/>
-        </w:rPr>
-        <w:t>r</w:t>
-      </w:r>
-      <w:r>
-        <w:rPr>
-          <w:rFonts w:ascii="Times New Roman" w:hAnsi="Times New Roman" w:cs="Times New Roman"/>
-          <w:sz w:val="28"/>
-          <w:szCs w:val="28"/>
-        </w:rPr>
-        <w:t xml:space="preserve"> isso:</w:t>
+        <w:t>: Se aparecer isso:</w:t>
       </w:r>
     </w:p>
     <w:p>
@@ -4840,25 +4781,50 @@
           <w:rFonts w:ascii="Times New Roman" w:hAnsi="Times New Roman" w:cs="Times New Roman"/>
           <w:sz w:val="28"/>
           <w:szCs w:val="28"/>
-          <w:lang w:val="en-US"/>
-        </w:rPr>
-      </w:pPr>
-      <w:r>
-        <w:rPr>
-          <w:rFonts w:ascii="Times New Roman" w:hAnsi="Times New Roman" w:cs="Times New Roman"/>
-          <w:sz w:val="28"/>
-          <w:szCs w:val="28"/>
-          <w:lang w:val="en-US"/>
-        </w:rPr>
-        <w:t xml:space="preserve">Executing task: </w:t>
-      </w:r>
+        </w:rPr>
+      </w:pPr>
       <w:proofErr w:type="spellStart"/>
       <w:r>
         <w:rPr>
           <w:rFonts w:ascii="Times New Roman" w:hAnsi="Times New Roman" w:cs="Times New Roman"/>
           <w:sz w:val="28"/>
           <w:szCs w:val="28"/>
-          <w:lang w:val="en-US"/>
+        </w:rPr>
+        <w:t>Executing</w:t>
+      </w:r>
+      <w:proofErr w:type="spellEnd"/>
+      <w:r>
+        <w:rPr>
+          <w:rFonts w:ascii="Times New Roman" w:hAnsi="Times New Roman" w:cs="Times New Roman"/>
+          <w:sz w:val="28"/>
+          <w:szCs w:val="28"/>
+        </w:rPr>
+        <w:t xml:space="preserve"> </w:t>
+      </w:r>
+      <w:proofErr w:type="spellStart"/>
+      <w:r>
+        <w:rPr>
+          <w:rFonts w:ascii="Times New Roman" w:hAnsi="Times New Roman" w:cs="Times New Roman"/>
+          <w:sz w:val="28"/>
+          <w:szCs w:val="28"/>
+        </w:rPr>
+        <w:t>task</w:t>
+      </w:r>
+      <w:proofErr w:type="spellEnd"/>
+      <w:r>
+        <w:rPr>
+          <w:rFonts w:ascii="Times New Roman" w:hAnsi="Times New Roman" w:cs="Times New Roman"/>
+          <w:sz w:val="28"/>
+          <w:szCs w:val="28"/>
+        </w:rPr>
+        <w:t xml:space="preserve">: </w:t>
+      </w:r>
+      <w:proofErr w:type="spellStart"/>
+      <w:r>
+        <w:rPr>
+          <w:rFonts w:ascii="Times New Roman" w:hAnsi="Times New Roman" w:cs="Times New Roman"/>
+          <w:sz w:val="28"/>
+          <w:szCs w:val="28"/>
         </w:rPr>
         <w:t>gcc</w:t>
       </w:r>
@@ -4868,7 +4834,6 @@
           <w:rFonts w:ascii="Times New Roman" w:hAnsi="Times New Roman" w:cs="Times New Roman"/>
           <w:sz w:val="28"/>
           <w:szCs w:val="28"/>
-          <w:lang w:val="en-US"/>
         </w:rPr>
         <w:t xml:space="preserve"> ...</w:t>
       </w:r>
@@ -4877,7 +4842,6 @@
           <w:rFonts w:ascii="Times New Roman" w:hAnsi="Times New Roman" w:cs="Times New Roman"/>
           <w:sz w:val="28"/>
           <w:szCs w:val="28"/>
-          <w:lang w:val="en-US"/>
         </w:rPr>
         <w:br/>
         <w:t xml:space="preserve">* Terminal </w:t>
@@ -4888,7 +4852,6 @@
           <w:rFonts w:ascii="Times New Roman" w:hAnsi="Times New Roman" w:cs="Times New Roman"/>
           <w:sz w:val="28"/>
           <w:szCs w:val="28"/>
-          <w:lang w:val="en-US"/>
         </w:rPr>
         <w:t>will</w:t>
       </w:r>
@@ -4898,7 +4861,6 @@
           <w:rFonts w:ascii="Times New Roman" w:hAnsi="Times New Roman" w:cs="Times New Roman"/>
           <w:sz w:val="28"/>
           <w:szCs w:val="28"/>
-          <w:lang w:val="en-US"/>
         </w:rPr>
         <w:t xml:space="preserve"> </w:t>
       </w:r>
@@ -4908,7 +4870,6 @@
           <w:rFonts w:ascii="Times New Roman" w:hAnsi="Times New Roman" w:cs="Times New Roman"/>
           <w:sz w:val="28"/>
           <w:szCs w:val="28"/>
-          <w:lang w:val="en-US"/>
         </w:rPr>
         <w:t>be</w:t>
       </w:r>
@@ -4918,7 +4879,6 @@
           <w:rFonts w:ascii="Times New Roman" w:hAnsi="Times New Roman" w:cs="Times New Roman"/>
           <w:sz w:val="28"/>
           <w:szCs w:val="28"/>
-          <w:lang w:val="en-US"/>
         </w:rPr>
         <w:t xml:space="preserve"> </w:t>
       </w:r>
@@ -4928,7 +4888,6 @@
           <w:rFonts w:ascii="Times New Roman" w:hAnsi="Times New Roman" w:cs="Times New Roman"/>
           <w:sz w:val="28"/>
           <w:szCs w:val="28"/>
-          <w:lang w:val="en-US"/>
         </w:rPr>
         <w:t>reused</w:t>
       </w:r>
@@ -4938,7 +4897,6 @@
           <w:rFonts w:ascii="Times New Roman" w:hAnsi="Times New Roman" w:cs="Times New Roman"/>
           <w:sz w:val="28"/>
           <w:szCs w:val="28"/>
-          <w:lang w:val="en-US"/>
         </w:rPr>
         <w:t>...</w:t>
       </w:r>
@@ -7966,6 +7924,7 @@
   <w:style w:type="character" w:default="1" w:styleId="Fontepargpadro">
     <w:name w:val="Default Paragraph Font"/>
     <w:uiPriority w:val="1"/>
+    <w:semiHidden/>
     <w:unhideWhenUsed/>
   </w:style>
   <w:style w:type="table" w:default="1" w:styleId="Tabelanormal">

</xml_diff>